<commit_message>
fix(cd1): update P3 target journal APJM → JABS throughout CĐ1 submission document
Three occurrences updated (lines 466, 963, 1001): footnote table source,
Phase 2 timeline, and APA reference entry. Matches CĐ2 fix from prior commit 967cc71.
Regenerated cd1_submission_final.docx.

https://claude.ai/code/session_01GMFmEtt6FYiJ4MKzBNCLqb
</commit_message>
<xml_diff>
--- a/chuyen_de/cd1/submission/cd1_submission_final.docx
+++ b/chuyen_de/cd1/submission/cd1_submission_final.docx
@@ -8658,7 +8658,7 @@
           <w:iCs/>
           <w:i/>
         </w:rPr>
-        <w:t xml:space="preserve">Nguồn: Tổng hợp từ World Bank Enterprise Surveys (2025); WGI từ Kaufmann et al. (2011); GNI từ World Bank (2025, July). Pattern WBES từ phân tích Chương 4 và Đỗ &amp; Phan (2026 — VEFR, APJM, JFAR, MIR under review).</w:t>
+        <w:t xml:space="preserve">Nguồn: Tổng hợp từ World Bank Enterprise Surveys (2025); WGI từ Kaufmann et al. (2011); GNI từ World Bank (2025, July). Pattern WBES từ phân tích Chương 4 và Đỗ &amp; Phan (2026 — VEFR, JABS, JFAR, MIR under review).</w:t>
       </w:r>
     </w:p>
     <w:p>
@@ -21487,7 +21487,7 @@
         <w:t xml:space="preserve">Giai đoạn 2 — Tháng 7/2026</w:t>
       </w:r>
       <w:r>
-        <w:t xml:space="preserve">: Nộp P3 (APJM) và P4 (MIR). Chuẩn bị dữ liệu WBES cho CĐ2 (101.185 obs, 47 nền kinh tế, 3 thế hệ schema harmonized). Phác thảo M0–M7 specification CĐ2.</w:t>
+        <w:t xml:space="preserve">: Nộp P3 (JABS) và P4 (MIR). Chuẩn bị dữ liệu WBES cho CĐ2 (101.185 obs, 47 nền kinh tế, 3 thế hệ schema harmonized). Phác thảo M0–M7 specification CĐ2.</w:t>
       </w:r>
     </w:p>
     <w:p>
@@ -21860,7 +21860,7 @@
           <w:iCs/>
           <w:i/>
         </w:rPr>
-        <w:t xml:space="preserve">Asia Pacific Journal of Management</w:t>
+        <w:t xml:space="preserve">Journal of Asia Business Studies</w:t>
       </w:r>
       <w:r>
         <w:t xml:space="preserve"> </w:t>

</xml_diff>